<commit_message>
Move fields around on InvestigationTiac
Make the UI more coherent by moving all fields related to the ARS
invetigation into the same block.

- Remove a field that was no correctly understood
- Move all the fields together to make it coherent, fields now have a
  relation together (you need to have an analysis to fill the other two
fields)

I tried to keep the test coherent to what was done while not adding to
many test for very specific behaviors.
</commit_message>
<xml_diff>
--- a/tiac/doc_templates/investigation_tiac.docx
+++ b/tiac/doc_templates/investigation_tiac.docx
@@ -362,24 +362,6 @@
           <w:sz w:val="20"/>
           <w:szCs w:val="20"/>
         </w:rPr>
-        <w:t>Enquête auprès des cas :{% if object.will_trigger_inquiry == True %} Oui {% elif object. will_trigger_inquiry == False%}Non {% endif%}</w:t>
-      </w:r>
-    </w:p>
-    <w:p>
-      <w:pPr>
-        <w:pStyle w:val="Corpsdetexte"/>
-        <w:rPr>
-          <w:rFonts w:ascii="Calibri" w:hAnsi="Calibri" w:cs="Calibri" w:asciiTheme="minorHAnsi" w:cstheme="minorHAnsi" w:hAnsiTheme="minorHAnsi"/>
-          <w:sz w:val="20"/>
-          <w:szCs w:val="20"/>
-        </w:rPr>
-      </w:pPr>
-      <w:r>
-        <w:rPr>
-          <w:rFonts w:cs="Calibri" w:ascii="Calibri" w:hAnsi="Calibri" w:asciiTheme="minorHAnsi" w:cstheme="minorHAnsi" w:hAnsiTheme="minorHAnsi"/>
-          <w:sz w:val="20"/>
-          <w:szCs w:val="20"/>
-        </w:rPr>
         <w:t>Numéro SIVSS : {{ object.numero_sivss or '-'  }}</w:t>
       </w:r>
     </w:p>
@@ -727,30 +709,7 @@
         </w:rPr>
       </w:pPr>
       <w:r>
-        <w:rPr>
-          <w:rFonts w:cs="Calibri" w:ascii="Calibri" w:hAnsi="Calibri" w:asciiTheme="minorHAnsi" w:cstheme="minorHAnsi" w:hAnsiTheme="minorHAnsi"/>
-          <w:sz w:val="20"/>
-          <w:szCs w:val="20"/>
-        </w:rPr>
-        <w:t>Analyses engagées sur les malades : {{ object.get_analys</w:t>
-      </w:r>
-      <w:bookmarkStart w:id="2" w:name="__DdeLink__773_3629366771"/>
-      <w:r>
-        <w:rPr>
-          <w:rFonts w:cs="Calibri" w:ascii="Calibri" w:hAnsi="Calibri" w:asciiTheme="minorHAnsi" w:cstheme="minorHAnsi" w:hAnsiTheme="minorHAnsi"/>
-          <w:sz w:val="20"/>
-          <w:szCs w:val="20"/>
-        </w:rPr>
-        <w:t>es_sur_les_malades_displa</w:t>
-      </w:r>
-      <w:bookmarkEnd w:id="2"/>
-      <w:r>
-        <w:rPr>
-          <w:rFonts w:cs="Calibri" w:ascii="Calibri" w:hAnsi="Calibri" w:asciiTheme="minorHAnsi" w:cstheme="minorHAnsi" w:hAnsiTheme="minorHAnsi"/>
-          <w:sz w:val="20"/>
-          <w:szCs w:val="20"/>
-        </w:rPr>
-        <w:t>y() }}</w:t>
+        <w:rPr/>
       </w:r>
     </w:p>
     <w:p>
@@ -763,12 +722,7 @@
         </w:rPr>
       </w:pPr>
       <w:r>
-        <w:rPr>
-          <w:rFonts w:cs="Calibri" w:ascii="Calibri" w:hAnsi="Calibri" w:asciiTheme="minorHAnsi" w:cstheme="minorHAnsi" w:hAnsiTheme="minorHAnsi"/>
-          <w:sz w:val="20"/>
-          <w:szCs w:val="20"/>
-        </w:rPr>
-        <w:t>Précisions : {{ object.precisions }}</w:t>
+        <w:rPr/>
       </w:r>
     </w:p>
     <w:p>
@@ -809,6 +763,60 @@
           <w:sz w:val="20"/>
           <w:szCs w:val="20"/>
         </w:rPr>
+      </w:r>
+    </w:p>
+    <w:p>
+      <w:pPr>
+        <w:pStyle w:val="Normal"/>
+        <w:rPr>
+          <w:rFonts w:ascii="Calibri" w:hAnsi="Calibri" w:cs="Calibri" w:asciiTheme="minorHAnsi" w:cstheme="minorHAnsi" w:hAnsiTheme="minorHAnsi"/>
+          <w:sz w:val="20"/>
+          <w:szCs w:val="20"/>
+        </w:rPr>
+      </w:pPr>
+      <w:r>
+        <w:rPr>
+          <w:rFonts w:cs="Calibri" w:ascii="Calibri" w:hAnsi="Calibri" w:asciiTheme="minorHAnsi" w:cstheme="minorHAnsi" w:hAnsiTheme="minorHAnsi"/>
+          <w:sz w:val="20"/>
+          <w:szCs w:val="20"/>
+        </w:rPr>
+        <w:t>Analyses engagées sur les malades : {{ object.get_analys</w:t>
+      </w:r>
+      <w:bookmarkStart w:id="2" w:name="__DdeLink__773_3629366771"/>
+      <w:r>
+        <w:rPr>
+          <w:rFonts w:cs="Calibri" w:ascii="Calibri" w:hAnsi="Calibri" w:asciiTheme="minorHAnsi" w:cstheme="minorHAnsi" w:hAnsiTheme="minorHAnsi"/>
+          <w:sz w:val="20"/>
+          <w:szCs w:val="20"/>
+        </w:rPr>
+        <w:t>es_sur_les_malades_displa</w:t>
+      </w:r>
+      <w:bookmarkEnd w:id="2"/>
+      <w:r>
+        <w:rPr>
+          <w:rFonts w:cs="Calibri" w:ascii="Calibri" w:hAnsi="Calibri" w:asciiTheme="minorHAnsi" w:cstheme="minorHAnsi" w:hAnsiTheme="minorHAnsi"/>
+          <w:sz w:val="20"/>
+          <w:szCs w:val="20"/>
+        </w:rPr>
+        <w:t>y() }}</w:t>
+      </w:r>
+    </w:p>
+    <w:p>
+      <w:pPr>
+        <w:pStyle w:val="Normal"/>
+        <w:rPr>
+          <w:rFonts w:ascii="Calibri" w:hAnsi="Calibri" w:cs="Calibri" w:asciiTheme="minorHAnsi" w:cstheme="minorHAnsi" w:hAnsiTheme="minorHAnsi"/>
+          <w:sz w:val="20"/>
+          <w:szCs w:val="20"/>
+        </w:rPr>
+      </w:pPr>
+      <w:r>
+        <w:rPr>
+          <w:rFonts w:cs="Calibri" w:ascii="Calibri" w:hAnsi="Calibri" w:asciiTheme="minorHAnsi" w:cstheme="minorHAnsi" w:hAnsiTheme="minorHAnsi"/>
+          <w:sz w:val="20"/>
+          <w:szCs w:val="20"/>
+        </w:rPr>
+        <w:t>Précisions : {{ object.precisions }}</w:t>
       </w:r>
     </w:p>
     <w:p>

</xml_diff>

<commit_message>
Fixes on the ARS block
- Make sure the treeselect is usable (CSS conflict with the DSFR). I
  guess this was not detected by the tests because we use force=True...
- Rename fields in Docx and CSV exports
- Fix the disable attribute for fields
</commit_message>
<xml_diff>
--- a/tiac/doc_templates/investigation_tiac.docx
+++ b/tiac/doc_templates/investigation_tiac.docx
@@ -709,7 +709,11 @@
         </w:rPr>
       </w:pPr>
       <w:r>
-        <w:rPr/>
+        <w:rPr>
+          <w:rFonts w:cs="Calibri" w:cstheme="minorHAnsi" w:ascii="Calibri" w:hAnsi="Calibri"/>
+          <w:sz w:val="20"/>
+          <w:szCs w:val="20"/>
+        </w:rPr>
       </w:r>
     </w:p>
     <w:p>
@@ -722,7 +726,11 @@
         </w:rPr>
       </w:pPr>
       <w:r>
-        <w:rPr/>
+        <w:rPr>
+          <w:rFonts w:cs="Calibri" w:cstheme="minorHAnsi" w:ascii="Calibri" w:hAnsi="Calibri"/>
+          <w:sz w:val="20"/>
+          <w:szCs w:val="20"/>
+        </w:rPr>
       </w:r>
     </w:p>
     <w:p>
@@ -745,7 +753,7 @@
           <w:sz w:val="24"/>
           <w:szCs w:val="24"/>
         </w:rPr>
-        <w:t>Agents pathogènes confirmés par l’ARS</w:t>
+        <w:t>Informations apportées par l’ARS</w:t>
       </w:r>
     </w:p>
     <w:p>
@@ -834,7 +842,7 @@
           <w:sz w:val="20"/>
           <w:szCs w:val="20"/>
         </w:rPr>
-        <w:t>Agents pathogènes confirmés par l’ARS : {{ object.agents_confirmes_ars_labels}}</w:t>
+        <w:t>Agent pathogène détecté sur les malades : {{ object.agents_confirmes_ars_labels}}</w:t>
       </w:r>
     </w:p>
     <w:p>

</xml_diff>